<commit_message>
AH - portfolio finished
</commit_message>
<xml_diff>
--- a/public/documents/alexhendrickx_project-approach.docx
+++ b/public/documents/alexhendrickx_project-approach.docx
@@ -11638,7 +11638,10 @@
                                       <w:pStyle w:val="Frontcover-hoofdtiteloranje"/>
                                     </w:pPr>
                                     <w:r>
-                                      <w:t>Plan van aanpak: IO Digital</w:t>
+                                      <w:t>Project Approach</w:t>
+                                    </w:r>
+                                    <w:r>
+                                      <w:t>: IO Digital</w:t>
                                     </w:r>
                                   </w:p>
                                 </w:tc>
@@ -12032,7 +12035,10 @@
                                 <w:pStyle w:val="Frontcover-hoofdtiteloranje"/>
                               </w:pPr>
                               <w:r>
-                                <w:t>Plan van aanpak: IO Digital</w:t>
+                                <w:t>Project Approach</w:t>
+                              </w:r>
+                              <w:r>
+                                <w:t>: IO Digital</w:t>
                               </w:r>
                             </w:p>
                           </w:tc>

</xml_diff>